<commit_message>
fixed no rodo handling
</commit_message>
<xml_diff>
--- a/data/cv_files/Eryk_Blaskowicz_CV.docx
+++ b/data/cv_files/Eryk_Blaskowicz_CV.docx
@@ -12,10 +12,10 @@
         <mc:AlternateContent>
           <mc:Choice Requires="wps">
             <w:drawing>
-              <wp:anchor distT="45720" distB="45720" distL="114300" distR="114300" simplePos="0" relativeHeight="251664384" behindDoc="0" locked="0" layoutInCell="1" allowOverlap="1" wp14:anchorId="6E0B77FA" wp14:editId="2FD21CCC">
+              <wp:anchor distT="45720" distB="45720" distL="114300" distR="114300" simplePos="0" relativeHeight="251664384" behindDoc="0" locked="0" layoutInCell="1" allowOverlap="1" wp14:anchorId="6E0B77FA" wp14:editId="56295CFC">
                 <wp:simplePos x="0" y="0"/>
                 <wp:positionH relativeFrom="column">
-                  <wp:posOffset>-133350</wp:posOffset>
+                  <wp:posOffset>-118110</wp:posOffset>
                 </wp:positionH>
                 <wp:positionV relativeFrom="paragraph">
                   <wp:posOffset>1743075</wp:posOffset>
@@ -98,18 +98,6 @@
                               </w:rPr>
                               <w:t xml:space="preserve"> </w:t>
                             </w:r>
-                            <w:hyperlink r:id="rId8" w:history="1">
-                              <w:r>
-                                <w:rPr>
-                                  <w:rStyle w:val="Hipercze"/>
-                                  <w:rFonts w:cs="Open Sans Light"/>
-                                  <w:color w:val="FFFFFF" w:themeColor="background1"/>
-                                  <w:sz w:val="28"/>
-                                  <w:szCs w:val="28"/>
-                                </w:rPr>
-                                <w:t>blaskowiczeryk@gmail.pl</w:t>
-                              </w:r>
-                            </w:hyperlink>
                             <w:r>
                               <w:rPr>
                                 <w:rFonts w:cs="Open Sans Light"/>
@@ -117,7 +105,7 @@
                                 <w:sz w:val="28"/>
                                 <w:szCs w:val="28"/>
                               </w:rPr>
-                              <w:t xml:space="preserve"> </w:t>
+                              <w:t>blaskowiczeryk@gmail.com</w:t>
                             </w:r>
                           </w:p>
                           <w:p>
@@ -154,7 +142,7 @@
                 <v:stroke joinstyle="miter"/>
                 <v:path gradientshapeok="t" o:connecttype="rect"/>
               </v:shapetype>
-              <v:shape id="Pole tekstowe 2" o:spid="_x0000_s1026" type="#_x0000_t202" style="position:absolute;margin-left:-10.5pt;margin-top:137.25pt;width:549.75pt;height:30.75pt;z-index:251664384;visibility:visible;mso-wrap-style:square;mso-width-percent:0;mso-height-percent:0;mso-wrap-distance-left:9pt;mso-wrap-distance-top:3.6pt;mso-wrap-distance-right:9pt;mso-wrap-distance-bottom:3.6pt;mso-position-horizontal:absolute;mso-position-horizontal-relative:text;mso-position-vertical:absolute;mso-position-vertical-relative:text;mso-width-percent:0;mso-height-percent:0;mso-width-relative:margin;mso-height-relative:margin;v-text-anchor:top" o:gfxdata="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" filled="f" stroked="f">
+              <v:shape id="Pole tekstowe 2" o:spid="_x0000_s1026" type="#_x0000_t202" style="position:absolute;margin-left:-9.3pt;margin-top:137.25pt;width:549.75pt;height:30.75pt;z-index:251664384;visibility:visible;mso-wrap-style:square;mso-width-percent:0;mso-height-percent:0;mso-wrap-distance-left:9pt;mso-wrap-distance-top:3.6pt;mso-wrap-distance-right:9pt;mso-wrap-distance-bottom:3.6pt;mso-position-horizontal:absolute;mso-position-horizontal-relative:text;mso-position-vertical:absolute;mso-position-vertical-relative:text;mso-width-percent:0;mso-height-percent:0;mso-width-relative:margin;mso-height-relative:margin;v-text-anchor:top" o:gfxdata="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" filled="f" stroked="f">
                 <v:textbox>
                   <w:txbxContent>
                     <w:p>
@@ -204,18 +192,6 @@
                         </w:rPr>
                         <w:t xml:space="preserve"> </w:t>
                       </w:r>
-                      <w:hyperlink r:id="rId9" w:history="1">
-                        <w:r>
-                          <w:rPr>
-                            <w:rStyle w:val="Hipercze"/>
-                            <w:rFonts w:cs="Open Sans Light"/>
-                            <w:color w:val="FFFFFF" w:themeColor="background1"/>
-                            <w:sz w:val="28"/>
-                            <w:szCs w:val="28"/>
-                          </w:rPr>
-                          <w:t>blaskowiczeryk@gmail.pl</w:t>
-                        </w:r>
-                      </w:hyperlink>
                       <w:r>
                         <w:rPr>
                           <w:rFonts w:cs="Open Sans Light"/>
@@ -223,7 +199,7 @@
                           <w:sz w:val="28"/>
                           <w:szCs w:val="28"/>
                         </w:rPr>
-                        <w:t xml:space="preserve"> </w:t>
+                        <w:t>blaskowiczeryk@gmail.com</w:t>
                       </w:r>
                     </w:p>
                     <w:p>
@@ -1719,7 +1695,7 @@
       </w:r>
     </w:p>
     <w:sectPr>
-      <w:footerReference w:type="default" r:id="rId10"/>
+      <w:footerReference w:type="default" r:id="rId8"/>
       <w:pgSz w:w="11906" w:h="16838"/>
       <w:pgMar w:top="720" w:right="720" w:bottom="720" w:left="720" w:header="708" w:footer="708" w:gutter="0"/>
       <w:cols w:space="708"/>
@@ -2578,7 +2554,6 @@
   <w:style w:type="character" w:default="1" w:styleId="Domylnaczcionkaakapitu">
     <w:name w:val="Default Paragraph Font"/>
     <w:uiPriority w:val="1"/>
-    <w:semiHidden/>
     <w:unhideWhenUsed/>
   </w:style>
   <w:style w:type="table" w:default="1" w:styleId="Standardowy">

</xml_diff>